<commit_message>
Fixed KPI bar on scroll (tab menu, Bear/Base/Bull, expand), keyboard shortcuts, sensitivity cell preview with apply-to-assumptions, computing state, changes-before-confirmation count with close warning, one-page Valuation Summary PDF, faster first visit of the assumptions tab, lighter font weights, phone top row; financial-instrument category notes read for receivables, payables and short-term borrowings; dilutive-securities line and check item; fade reinvestment candidates; snapshots, examples, demo GIF and screenshots rebuilt
</commit_message>
<xml_diff>
--- a/examples/036200_general/036200_report_draft_example.docx
+++ b/examples/036200_general/036200_report_draft_example.docx
@@ -133,7 +133,7 @@
               <w:rPr>
                 <w:sz w:val="17"/>
               </w:rPr>
-              <w:t>6,036~7,003원 (SRP 0%: 7,003원)</w:t>
+              <w:t>5,325~6,283원 (SRP 0%: 6,283원)</w:t>
             </w:r>
           </w:p>
         </w:tc>
@@ -161,7 +161,7 @@
               <w:rPr>
                 <w:sz w:val="17"/>
               </w:rPr>
-              <w:t>EV/EBITDA 5,261~7,287원 / PER 4,487~9,944원 / EV/Sales 10,756~17,067원 / PBR 9,455~14,374원</w:t>
+              <w:t>EV/EBITDA 5,091~7,117원 / PER 4,487~9,944원 / EV/Sales 10,586~16,897원 / PBR 9,455~14,374원</w:t>
             </w:r>
           </w:p>
         </w:tc>
@@ -489,7 +489,7 @@
         <w:rPr>
           <w:i w:val="0"/>
         </w:rPr>
-        <w:t>신호등(사전 고정 기준, 엑셀 Diagnostics A): 종합 빨강 — 피어 초록(DCF 7,003원 vs 피어 EV/EBITDA 사분위 5,261~7,287원), 시장 빨강(DCF ÷ 종가 0.35)</w:t>
+        <w:t>신호등(사전 고정 기준, 엑셀 Diagnostics A): 종합 빨강 — 피어 초록(DCF 6,283원 vs 피어 EV/EBITDA 사분위 5,091~7,117원), 시장 빨강(DCF ÷ 종가 0.31)</w:t>
       </w:r>
     </w:p>
     <w:p>
@@ -505,7 +505,7 @@
         <w:rPr>
           <w:i w:val="0"/>
         </w:rPr>
-        <w:t>기본 경로 v2 주당 7,003원, 대안 v1(3년 평균 이익률·5년 CAGR) 주당 4,133원. v2 출발 이익률 5.35%, 2032년까지 피어 쪽 이동 4.80%, 출발 성장률 6.79%</w:t>
+        <w:t>기본 경로 v2 주당 6,283원, 대안 v1(3년 평균 이익률·5년 CAGR) 주당 3,462원. v2 출발 이익률 5.35%, 2032년까지 피어 쪽 이동 4.80%, 출발 성장률 6.79%</w:t>
       </w:r>
     </w:p>
     <w:p>
@@ -618,7 +618,7 @@
               <w:rPr>
                 <w:sz w:val="17"/>
               </w:rPr>
-              <w:t>6,561</w:t>
+              <w:t>6,391</w:t>
             </w:r>
           </w:p>
         </w:tc>
@@ -672,7 +672,7 @@
               <w:rPr>
                 <w:sz w:val="17"/>
               </w:rPr>
-              <w:t>4.80%</w:t>
+              <w:t>5.48%</w:t>
             </w:r>
           </w:p>
         </w:tc>
@@ -685,7 +685,7 @@
               <w:rPr>
                 <w:sz w:val="17"/>
               </w:rPr>
-              <w:t>-0.55%</w:t>
+              <w:t>0.13%</w:t>
             </w:r>
           </w:p>
         </w:tc>
@@ -726,7 +726,7 @@
               <w:rPr>
                 <w:sz w:val="17"/>
               </w:rPr>
-              <w:t>-0.81%</w:t>
+              <w:t>11.13%</w:t>
             </w:r>
           </w:p>
         </w:tc>
@@ -739,7 +739,7 @@
               <w:rPr>
                 <w:sz w:val="17"/>
               </w:rPr>
-              <w:t>-7.59%</w:t>
+              <w:t>4.35%</w:t>
             </w:r>
           </w:p>
         </w:tc>
@@ -767,7 +767,7 @@
               <w:rPr>
                 <w:sz w:val="17"/>
               </w:rPr>
-              <w:t>11.97%</w:t>
+              <w:t>11.90%</w:t>
             </w:r>
           </w:p>
         </w:tc>
@@ -780,7 +780,7 @@
               <w:rPr>
                 <w:sz w:val="17"/>
               </w:rPr>
-              <w:t>12.79%</w:t>
+              <w:t>11.71%</w:t>
             </w:r>
           </w:p>
         </w:tc>
@@ -793,7 +793,7 @@
               <w:rPr>
                 <w:sz w:val="17"/>
               </w:rPr>
-              <w:t>0.82%</w:t>
+              <w:t>-0.18%</w:t>
             </w:r>
           </w:p>
         </w:tc>
@@ -937,7 +937,7 @@
               <w:rPr>
                 <w:sz w:val="17"/>
               </w:rPr>
-              <w:t>135,011</w:t>
+              <w:t>118,847</w:t>
             </w:r>
           </w:p>
         </w:tc>
@@ -950,7 +950,7 @@
               <w:rPr>
                 <w:sz w:val="17"/>
               </w:rPr>
-              <w:t>65.5%</w:t>
+              <w:t>64.3%</w:t>
             </w:r>
           </w:p>
         </w:tc>
@@ -978,7 +978,7 @@
               <w:rPr>
                 <w:sz w:val="17"/>
               </w:rPr>
-              <w:t>57,861</w:t>
+              <w:t>58,813</w:t>
             </w:r>
           </w:p>
         </w:tc>
@@ -991,7 +991,7 @@
               <w:rPr>
                 <w:sz w:val="17"/>
               </w:rPr>
-              <w:t>28.1%</w:t>
+              <w:t>31.8%</w:t>
             </w:r>
           </w:p>
         </w:tc>
@@ -1019,7 +1019,7 @@
               <w:rPr>
                 <w:sz w:val="17"/>
               </w:rPr>
-              <w:t>77,150</w:t>
+              <w:t>60,034</w:t>
             </w:r>
           </w:p>
         </w:tc>
@@ -1032,7 +1032,7 @@
               <w:rPr>
                 <w:sz w:val="17"/>
               </w:rPr>
-              <w:t>37.5%</w:t>
+              <w:t>32.5%</w:t>
             </w:r>
           </w:p>
         </w:tc>
@@ -1073,7 +1073,7 @@
               <w:rPr>
                 <w:sz w:val="17"/>
               </w:rPr>
-              <w:t>30.2%</w:t>
+              <w:t>33.7%</w:t>
             </w:r>
           </w:p>
         </w:tc>
@@ -1114,7 +1114,7 @@
               <w:rPr>
                 <w:sz w:val="17"/>
               </w:rPr>
-              <w:t>5.8%</w:t>
+              <w:t>6.5%</w:t>
             </w:r>
           </w:p>
         </w:tc>
@@ -1142,7 +1142,7 @@
               <w:rPr>
                 <w:sz w:val="17"/>
               </w:rPr>
-              <w:t>-3,051</w:t>
+              <w:t>-8,051</w:t>
             </w:r>
           </w:p>
         </w:tc>
@@ -1155,7 +1155,7 @@
               <w:rPr>
                 <w:sz w:val="17"/>
               </w:rPr>
-              <w:t>-1.5%</w:t>
+              <w:t>-4.4%</w:t>
             </w:r>
           </w:p>
         </w:tc>
@@ -1224,7 +1224,7 @@
               <w:rPr>
                 <w:sz w:val="17"/>
               </w:rPr>
-              <w:t>205,991</w:t>
+              <w:t>184,827</w:t>
             </w:r>
           </w:p>
         </w:tc>
@@ -1273,7 +1273,7 @@
         <w:pStyle w:val="ListBullet"/>
       </w:pPr>
       <w:r>
-        <w:t>과거 3년 ROIC(RONIC 상한) &lt; 기본 WACC — -2.1%</w:t>
+        <w:t>과거 3년 ROIC(RONIC 상한) &lt; 기본 WACC — -4.7%</w:t>
       </w:r>
     </w:p>
     <w:p>
@@ -1386,7 +1386,7 @@
               <w:rPr>
                 <w:sz w:val="17"/>
               </w:rPr>
-              <w:t>7,003</w:t>
+              <w:t>6,283</w:t>
             </w:r>
           </w:p>
         </w:tc>
@@ -1440,7 +1440,7 @@
               <w:rPr>
                 <w:sz w:val="17"/>
               </w:rPr>
-              <w:t>8,714</w:t>
+              <w:t>8,006</w:t>
             </w:r>
           </w:p>
         </w:tc>
@@ -1453,7 +1453,7 @@
               <w:rPr>
                 <w:sz w:val="17"/>
               </w:rPr>
-              <w:t>1,712</w:t>
+              <w:t>1,723</w:t>
             </w:r>
           </w:p>
         </w:tc>
@@ -1494,7 +1494,7 @@
               <w:rPr>
                 <w:sz w:val="17"/>
               </w:rPr>
-              <w:t>14,671</w:t>
+              <w:t>14,001</w:t>
             </w:r>
           </w:p>
         </w:tc>
@@ -1507,7 +1507,7 @@
               <w:rPr>
                 <w:sz w:val="17"/>
               </w:rPr>
-              <w:t>7,669</w:t>
+              <w:t>7,718</w:t>
             </w:r>
           </w:p>
         </w:tc>
@@ -1678,7 +1678,7 @@
               <w:rPr>
                 <w:sz w:val="17"/>
               </w:rPr>
-              <w:t>7,003</w:t>
+              <w:t>6,283</w:t>
             </w:r>
           </w:p>
         </w:tc>
@@ -1786,7 +1786,7 @@
               <w:rPr>
                 <w:sz w:val="17"/>
               </w:rPr>
-              <w:t>7,004</w:t>
+              <w:t>6,285</w:t>
             </w:r>
           </w:p>
         </w:tc>
@@ -1799,7 +1799,7 @@
               <w:rPr>
                 <w:sz w:val="17"/>
               </w:rPr>
-              <w:t>1</w:t>
+              <w:t>2</w:t>
             </w:r>
           </w:p>
         </w:tc>
@@ -1840,7 +1840,7 @@
               <w:rPr>
                 <w:sz w:val="17"/>
               </w:rPr>
-              <w:t>7,000</w:t>
+              <w:t>6,280</w:t>
             </w:r>
           </w:p>
         </w:tc>
@@ -2024,7 +2024,7 @@
               <w:rPr>
                 <w:sz w:val="17"/>
               </w:rPr>
-              <w:t>7,669</w:t>
+              <w:t>7,718</w:t>
             </w:r>
           </w:p>
         </w:tc>
@@ -2037,7 +2037,7 @@
               <w:rPr>
                 <w:sz w:val="17"/>
               </w:rPr>
-              <w:t>109.5%</w:t>
+              <w:t>122.8%</w:t>
             </w:r>
           </w:p>
         </w:tc>
@@ -2104,7 +2104,7 @@
               <w:rPr>
                 <w:sz w:val="17"/>
               </w:rPr>
-              <w:t>-2,877</w:t>
+              <w:t>-2,900</w:t>
             </w:r>
           </w:p>
         </w:tc>
@@ -2117,7 +2117,7 @@
               <w:rPr>
                 <w:sz w:val="17"/>
               </w:rPr>
-              <w:t>-41.1%</w:t>
+              <w:t>-46.2%</w:t>
             </w:r>
           </w:p>
         </w:tc>
@@ -2184,7 +2184,7 @@
               <w:rPr>
                 <w:sz w:val="17"/>
               </w:rPr>
-              <w:t>-2,870</w:t>
+              <w:t>-2,821</w:t>
             </w:r>
           </w:p>
         </w:tc>
@@ -2197,7 +2197,7 @@
               <w:rPr>
                 <w:sz w:val="17"/>
               </w:rPr>
-              <w:t>-41.0%</w:t>
+              <w:t>-44.9%</w:t>
             </w:r>
           </w:p>
         </w:tc>
@@ -2225,7 +2225,7 @@
               <w:rPr>
                 <w:sz w:val="17"/>
               </w:rPr>
-              <w:t>시나리오 폭</w:t>
+              <w:t>재투자 비율</w:t>
             </w:r>
           </w:p>
         </w:tc>
@@ -2238,7 +2238,7 @@
               <w:rPr>
                 <w:sz w:val="17"/>
               </w:rPr>
-              <w:t>±2%p(성장·이익률) 기본값, g 2%</w:t>
+              <w:t>CAPEX ÷ 매출(3년 평균)</w:t>
             </w:r>
           </w:p>
         </w:tc>
@@ -2251,7 +2251,7 @@
               <w:rPr>
                 <w:sz w:val="17"/>
               </w:rPr>
-              <w:t>낙관(+2%p)</w:t>
+              <w:t>마지막 명시 연도 재투자 = 수렴 규칙(A) CAPEX ÷ 매출 1.54%(명시 → 수렴 FCFF 2.71배, 기본 CAPEX ÷ 매출 3년 평균 5.59%)</w:t>
             </w:r>
           </w:p>
         </w:tc>
@@ -2264,7 +2264,7 @@
               <w:rPr>
                 <w:sz w:val="17"/>
               </w:rPr>
-              <w:t>1,799</w:t>
+              <w:t>2,120</w:t>
             </w:r>
           </w:p>
         </w:tc>
@@ -2277,7 +2277,7 @@
               <w:rPr>
                 <w:sz w:val="17"/>
               </w:rPr>
-              <w:t>25.7%</w:t>
+              <w:t>33.7%</w:t>
             </w:r>
           </w:p>
         </w:tc>
@@ -2305,7 +2305,7 @@
               <w:rPr>
                 <w:sz w:val="17"/>
               </w:rPr>
-              <w:t>할인율</w:t>
+              <w:t>시나리오 폭</w:t>
             </w:r>
           </w:p>
         </w:tc>
@@ -2318,7 +2318,7 @@
               <w:rPr>
                 <w:sz w:val="17"/>
               </w:rPr>
-              <w:t>SRP 열</w:t>
+              <w:t>±2%p(성장·이익률) 기본값, g 2%</w:t>
             </w:r>
           </w:p>
         </w:tc>
@@ -2331,7 +2331,7 @@
               <w:rPr>
                 <w:sz w:val="17"/>
               </w:rPr>
-              <w:t>SRP 2%</w:t>
+              <w:t>낙관(+2%p)</w:t>
             </w:r>
           </w:p>
         </w:tc>
@@ -2344,7 +2344,7 @@
               <w:rPr>
                 <w:sz w:val="17"/>
               </w:rPr>
-              <w:t>-967</w:t>
+              <w:t>1,732</w:t>
             </w:r>
           </w:p>
         </w:tc>
@@ -2357,7 +2357,7 @@
               <w:rPr>
                 <w:sz w:val="17"/>
               </w:rPr>
-              <w:t>-13.8%</w:t>
+              <w:t>27.6%</w:t>
             </w:r>
           </w:p>
         </w:tc>
@@ -2839,7 +2839,7 @@
               <w:rPr>
                 <w:sz w:val="17"/>
               </w:rPr>
-              <w:t>7,003원(기본·SRP 0%)</w:t>
+              <w:t>6,283원(기본·SRP 0%)</w:t>
             </w:r>
           </w:p>
         </w:tc>
@@ -4502,7 +4502,7 @@
               <w:rPr>
                 <w:sz w:val="17"/>
               </w:rPr>
-              <w:t>0.012</w:t>
+              <w:t>0.028</w:t>
             </w:r>
           </w:p>
         </w:tc>
@@ -4580,7 +4580,7 @@
               <w:rPr>
                 <w:sz w:val="17"/>
               </w:rPr>
-              <w:t>11.650%</w:t>
+              <w:t>5.563%</w:t>
             </w:r>
           </w:p>
         </w:tc>
@@ -4659,7 +4659,7 @@
               <w:rPr>
                 <w:sz w:val="17"/>
               </w:rPr>
-              <w:t>11.650%</w:t>
+              <w:t>5.563%</w:t>
             </w:r>
           </w:p>
         </w:tc>
@@ -4710,7 +4710,7 @@
               <w:rPr>
                 <w:sz w:val="17"/>
               </w:rPr>
-              <w:t>사용(D/V 1.2%)</w:t>
+              <w:t>사용(D/V 2.7%)</w:t>
             </w:r>
           </w:p>
         </w:tc>
@@ -4789,7 +4789,7 @@
               <w:rPr>
                 <w:sz w:val="17"/>
               </w:rPr>
-              <w:t>사용(D/V 1.2%)</w:t>
+              <w:t>사용(D/V 2.7%)</w:t>
             </w:r>
           </w:p>
         </w:tc>
@@ -4817,7 +4817,7 @@
               <w:rPr>
                 <w:sz w:val="17"/>
               </w:rPr>
-              <w:t>11.974%</w:t>
+              <w:t>11.895%</w:t>
             </w:r>
           </w:p>
         </w:tc>
@@ -4895,7 +4895,7 @@
               <w:rPr>
                 <w:sz w:val="17"/>
               </w:rPr>
-              <w:t>12.0%</w:t>
+              <w:t>11.9%</w:t>
             </w:r>
           </w:p>
         </w:tc>
@@ -5123,7 +5123,7 @@
           <w:i w:val="0"/>
           <w:sz w:val="18"/>
         </w:rPr>
-        <w:t>Rf 만기: 기본은 국고채 5년(P3 공통 장부, 사전 고정)이다. 실무 외부평가 의견서는 10년이 대부분이다(P5-B, Rf 만기 표시 57건 중 10년 56건). 10년을 쓰면 기본 시나리오·SRP 0% 주당 7,003원 → 6,888원이다(엑셀 Scenarios G 표, Inputs 'Rf 만기 선택'). SRP 인용 참고값은 민감도에만 쓴다(6장 G 표).</w:t>
+        <w:t>Rf 만기: 기본은 국고채 5년(P3 공통 장부, 사전 고정)이다. 실무 외부평가 의견서는 10년이 대부분이다(P5-B, Rf 만기 표시 57건 중 10년 56건). 10년을 쓰면 기본 시나리오·SRP 0% 주당 6,283원 → 6,170원이다(엑셀 Scenarios G 표, Inputs 'Rf 만기 선택'). SRP 인용 참고값은 민감도에만 쓴다(6장 G 표).</w:t>
       </w:r>
     </w:p>
     <w:p>
@@ -5139,7 +5139,7 @@
         <w:rPr>
           <w:i w:val="0"/>
         </w:rPr>
-        <w:t>기본 경로 v2(P7-B2b 사전 고정, config/p7b2b.yaml): 출발 성장률 = 매출 CAGR(FY2020→FY2025)과 피어 성장률의 혼합, 출발 이익률 = 5년 중앙값 → 피어 쪽 수렴(엑셀 Forecast v2 블록). 아래 CAGR·3년 평균은 v1 값: 4.91% + 시나리오 이동, 2030년까지 g로 체감. 정상 영업이익률 = 과거 3년 평균 5.35% + 이동. D&amp;A·CAPEX·회전일수는 과거 3년 평균. RONIC 상한 = 과거 3년 ROIC 9.9%</w:t>
+        <w:t>기본 경로 v2(P7-B2b 사전 고정, config/p7b2b.yaml): 출발 성장률 = 매출 CAGR(FY2020→FY2025)과 피어 성장률의 혼합, 출발 이익률 = 5년 중앙값 → 피어 쪽 수렴(엑셀 Forecast v2 블록). 아래 CAGR·3년 평균은 v1 값: 4.91% + 시나리오 이동, 2030년까지 g로 체감. 정상 영업이익률 = 과거 3년 평균 5.35% + 이동. D&amp;A·CAPEX·회전일수는 과거 3년 평균. RONIC 상한 = 과거 3년 ROIC 7.2%</w:t>
       </w:r>
     </w:p>
     <w:tbl>
@@ -6299,7 +6299,7 @@
               <w:rPr>
                 <w:sz w:val="17"/>
               </w:rPr>
-              <w:t>135,011</w:t>
+              <w:t>118,847</w:t>
             </w:r>
           </w:p>
         </w:tc>
@@ -6340,7 +6340,7 @@
               <w:rPr>
                 <w:sz w:val="17"/>
               </w:rPr>
-              <w:t>-59,146</w:t>
+              <w:t>-54,146</w:t>
             </w:r>
           </w:p>
         </w:tc>
@@ -6381,7 +6381,7 @@
               <w:rPr>
                 <w:sz w:val="17"/>
               </w:rPr>
-              <w:t>205,991</w:t>
+              <w:t>184,827</w:t>
             </w:r>
           </w:p>
         </w:tc>
@@ -6616,7 +6616,7 @@
               <w:rPr>
                 <w:sz w:val="17"/>
               </w:rPr>
-              <w:t>5,345</w:t>
+              <w:t>4,691</w:t>
             </w:r>
           </w:p>
         </w:tc>
@@ -6629,7 +6629,7 @@
               <w:rPr>
                 <w:sz w:val="17"/>
               </w:rPr>
-              <w:t>4,955</w:t>
+              <w:t>4,306</w:t>
             </w:r>
           </w:p>
         </w:tc>
@@ -6642,7 +6642,7 @@
               <w:rPr>
                 <w:sz w:val="17"/>
               </w:rPr>
-              <w:t>4,628</w:t>
+              <w:t>3,982</w:t>
             </w:r>
           </w:p>
         </w:tc>
@@ -6670,7 +6670,7 @@
               <w:rPr>
                 <w:sz w:val="17"/>
               </w:rPr>
-              <w:t>7,003</w:t>
+              <w:t>6,283</w:t>
             </w:r>
           </w:p>
         </w:tc>
@@ -6683,7 +6683,7 @@
               <w:rPr>
                 <w:sz w:val="17"/>
               </w:rPr>
-              <w:t>6,478</w:t>
+              <w:t>5,763</w:t>
             </w:r>
           </w:p>
         </w:tc>
@@ -6696,7 +6696,7 @@
               <w:rPr>
                 <w:sz w:val="17"/>
               </w:rPr>
-              <w:t>6,036</w:t>
+              <w:t>5,325</w:t>
             </w:r>
           </w:p>
         </w:tc>
@@ -6724,7 +6724,7 @@
               <w:rPr>
                 <w:sz w:val="17"/>
               </w:rPr>
-              <w:t>8,801</w:t>
+              <w:t>8,015</w:t>
             </w:r>
           </w:p>
         </w:tc>
@@ -6737,7 +6737,7 @@
               <w:rPr>
                 <w:sz w:val="17"/>
               </w:rPr>
-              <w:t>8,130</w:t>
+              <w:t>7,349</w:t>
             </w:r>
           </w:p>
         </w:tc>
@@ -6750,7 +6750,7 @@
               <w:rPr>
                 <w:sz w:val="17"/>
               </w:rPr>
-              <w:t>7,562</w:t>
+              <w:t>6,786</w:t>
             </w:r>
           </w:p>
         </w:tc>
@@ -6854,7 +6854,7 @@
               <w:rPr>
                 <w:sz w:val="17"/>
               </w:rPr>
-              <w:t>11.97%</w:t>
+              <w:t>11.90%</w:t>
             </w:r>
           </w:p>
         </w:tc>
@@ -6867,7 +6867,7 @@
               <w:rPr>
                 <w:sz w:val="17"/>
               </w:rPr>
-              <w:t>12.96%</w:t>
+              <w:t>12.87%</w:t>
             </w:r>
           </w:p>
         </w:tc>
@@ -6880,7 +6880,7 @@
               <w:rPr>
                 <w:sz w:val="17"/>
               </w:rPr>
-              <w:t>13.95%</w:t>
+              <w:t>13.84%</w:t>
             </w:r>
           </w:p>
         </w:tc>
@@ -6908,7 +6908,7 @@
               <w:rPr>
                 <w:sz w:val="17"/>
               </w:rPr>
-              <w:t>11.97%</w:t>
+              <w:t>11.90%</w:t>
             </w:r>
           </w:p>
         </w:tc>
@@ -6921,7 +6921,7 @@
               <w:rPr>
                 <w:sz w:val="17"/>
               </w:rPr>
-              <w:t>12.96%</w:t>
+              <w:t>12.87%</w:t>
             </w:r>
           </w:p>
         </w:tc>
@@ -6934,7 +6934,7 @@
               <w:rPr>
                 <w:sz w:val="17"/>
               </w:rPr>
-              <w:t>13.95%</w:t>
+              <w:t>13.84%</w:t>
             </w:r>
           </w:p>
         </w:tc>
@@ -6962,7 +6962,7 @@
               <w:rPr>
                 <w:sz w:val="17"/>
               </w:rPr>
-              <w:t>11.97%</w:t>
+              <w:t>11.90%</w:t>
             </w:r>
           </w:p>
         </w:tc>
@@ -6975,7 +6975,7 @@
               <w:rPr>
                 <w:sz w:val="17"/>
               </w:rPr>
-              <w:t>12.96%</w:t>
+              <w:t>12.87%</w:t>
             </w:r>
           </w:p>
         </w:tc>
@@ -6988,7 +6988,7 @@
               <w:rPr>
                 <w:sz w:val="17"/>
               </w:rPr>
-              <w:t>13.95%</w:t>
+              <w:t>13.84%</w:t>
             </w:r>
           </w:p>
         </w:tc>
@@ -7000,7 +7000,7 @@
         <w:rPr>
           <w:i w:val="0"/>
         </w:rPr>
-        <w:t>기준일 종가 20,000원과 기본 시나리오(SRP 열 1) 값 7,003원의 차이는 성장·이익률·할인율 가정의 차이로 읽는다(판단 아님).</w:t>
+        <w:t>기준일 종가 20,000원과 기본 시나리오(SRP 열 1) 값 6,283원의 차이는 성장·이익률·할인율 가정의 차이로 읽는다(판단 아님).</w:t>
       </w:r>
     </w:p>
     <w:p>
@@ -7114,7 +7114,7 @@
               <w:rPr>
                 <w:sz w:val="17"/>
               </w:rPr>
-              <w:t>7,003</w:t>
+              <w:t>6,283</w:t>
             </w:r>
           </w:p>
         </w:tc>
@@ -7127,7 +7127,7 @@
               <w:rPr>
                 <w:sz w:val="17"/>
               </w:rPr>
-              <w:t>6.36</w:t>
+              <w:t>6.40</w:t>
             </w:r>
           </w:p>
         </w:tc>
@@ -7153,7 +7153,7 @@
               <w:rPr>
                 <w:sz w:val="17"/>
               </w:rPr>
-              <w:t>42.9%</w:t>
+              <w:t>49.5%</w:t>
             </w:r>
           </w:p>
         </w:tc>
@@ -7181,7 +7181,7 @@
               <w:rPr>
                 <w:sz w:val="17"/>
               </w:rPr>
-              <w:t>7,344</w:t>
+              <w:t>6,616</w:t>
             </w:r>
           </w:p>
         </w:tc>
@@ -7207,7 +7207,7 @@
               <w:rPr>
                 <w:sz w:val="17"/>
               </w:rPr>
-              <w:t>3.36%</w:t>
+              <w:t>3.30%</w:t>
             </w:r>
           </w:p>
         </w:tc>
@@ -7220,7 +7220,7 @@
               <w:rPr>
                 <w:sz w:val="17"/>
               </w:rPr>
-              <w:t>46.8%</w:t>
+              <w:t>53.3%</w:t>
             </w:r>
           </w:p>
         </w:tc>
@@ -7232,7 +7232,7 @@
         <w:rPr>
           <w:i w:val="0"/>
         </w:rPr>
-        <w:t>Exit 배수 7.46배를 쓰면 주당 7,344원이고, Gordon 영구가치의 함의 배수는 6.36배다(주당 7,003원). Exit 방식의 함의 영구성장률은 3.36%고 영구가치 비중은 Gordon 42.9%, Exit 46.8%다.</w:t>
+        <w:t>Exit 배수 7.46배를 쓰면 주당 6,616원이고, Gordon 영구가치의 함의 배수는 6.40배다(주당 6,283원). Exit 방식의 함의 영구성장률은 3.30%고 영구가치 비중은 Gordon 49.5%, Exit 53.3%다.</w:t>
       </w:r>
     </w:p>
     <w:p>
@@ -7440,7 +7440,7 @@
               <w:rPr>
                 <w:sz w:val="17"/>
               </w:rPr>
-              <w:t>5,261</w:t>
+              <w:t>5,091</w:t>
             </w:r>
           </w:p>
         </w:tc>
@@ -7453,7 +7453,7 @@
               <w:rPr>
                 <w:sz w:val="17"/>
               </w:rPr>
-              <w:t>6,561</w:t>
+              <w:t>6,391</w:t>
             </w:r>
           </w:p>
         </w:tc>
@@ -7466,7 +7466,7 @@
               <w:rPr>
                 <w:sz w:val="17"/>
               </w:rPr>
-              <w:t>7,287</w:t>
+              <w:t>7,117</w:t>
             </w:r>
           </w:p>
         </w:tc>
@@ -7546,7 +7546,7 @@
               <w:rPr>
                 <w:sz w:val="17"/>
               </w:rPr>
-              <w:t>5,261</w:t>
+              <w:t>5,091</w:t>
             </w:r>
           </w:p>
         </w:tc>
@@ -7559,7 +7559,7 @@
               <w:rPr>
                 <w:sz w:val="17"/>
               </w:rPr>
-              <w:t>6,561</w:t>
+              <w:t>6,391</w:t>
             </w:r>
           </w:p>
         </w:tc>
@@ -7572,7 +7572,7 @@
               <w:rPr>
                 <w:sz w:val="17"/>
               </w:rPr>
-              <w:t>7,287</w:t>
+              <w:t>7,117</w:t>
             </w:r>
           </w:p>
         </w:tc>
@@ -7652,7 +7652,7 @@
               <w:rPr>
                 <w:sz w:val="17"/>
               </w:rPr>
-              <w:t>10,756</w:t>
+              <w:t>10,586</w:t>
             </w:r>
           </w:p>
         </w:tc>
@@ -7665,7 +7665,7 @@
               <w:rPr>
                 <w:sz w:val="17"/>
               </w:rPr>
-              <w:t>12,826</w:t>
+              <w:t>12,656</w:t>
             </w:r>
           </w:p>
         </w:tc>
@@ -7678,7 +7678,7 @@
               <w:rPr>
                 <w:sz w:val="17"/>
               </w:rPr>
-              <w:t>17,067</w:t>
+              <w:t>16,897</w:t>
             </w:r>
           </w:p>
         </w:tc>
@@ -8287,7 +8287,7 @@
               <w:rPr>
                 <w:sz w:val="17"/>
               </w:rPr>
-              <w:t>4,628</w:t>
+              <w:t>3,982</w:t>
             </w:r>
           </w:p>
         </w:tc>
@@ -8300,7 +8300,7 @@
               <w:rPr>
                 <w:sz w:val="17"/>
               </w:rPr>
-              <w:t>5,345</w:t>
+              <w:t>4,691</w:t>
             </w:r>
           </w:p>
         </w:tc>
@@ -8313,7 +8313,7 @@
               <w:rPr>
                 <w:sz w:val="17"/>
               </w:rPr>
-              <w:t>5,345</w:t>
+              <w:t>4,691</w:t>
             </w:r>
           </w:p>
         </w:tc>
@@ -8354,7 +8354,7 @@
               <w:rPr>
                 <w:sz w:val="17"/>
               </w:rPr>
-              <w:t>6,036</w:t>
+              <w:t>5,325</w:t>
             </w:r>
           </w:p>
         </w:tc>
@@ -8367,7 +8367,7 @@
               <w:rPr>
                 <w:sz w:val="17"/>
               </w:rPr>
-              <w:t>7,003</w:t>
+              <w:t>6,283</w:t>
             </w:r>
           </w:p>
         </w:tc>
@@ -8380,7 +8380,7 @@
               <w:rPr>
                 <w:sz w:val="17"/>
               </w:rPr>
-              <w:t>7,003</w:t>
+              <w:t>6,283</w:t>
             </w:r>
           </w:p>
         </w:tc>
@@ -8421,7 +8421,7 @@
               <w:rPr>
                 <w:sz w:val="17"/>
               </w:rPr>
-              <w:t>7,562</w:t>
+              <w:t>6,786</w:t>
             </w:r>
           </w:p>
         </w:tc>
@@ -8434,7 +8434,7 @@
               <w:rPr>
                 <w:sz w:val="17"/>
               </w:rPr>
-              <w:t>8,801</w:t>
+              <w:t>8,015</w:t>
             </w:r>
           </w:p>
         </w:tc>
@@ -8447,7 +8447,7 @@
               <w:rPr>
                 <w:sz w:val="17"/>
               </w:rPr>
-              <w:t>8,801</w:t>
+              <w:t>8,015</w:t>
             </w:r>
           </w:p>
         </w:tc>
@@ -8488,7 +8488,7 @@
               <w:rPr>
                 <w:sz w:val="17"/>
               </w:rPr>
-              <w:t>5,261</w:t>
+              <w:t>5,091</w:t>
             </w:r>
           </w:p>
         </w:tc>
@@ -8501,7 +8501,7 @@
               <w:rPr>
                 <w:sz w:val="17"/>
               </w:rPr>
-              <w:t>7,287</w:t>
+              <w:t>7,117</w:t>
             </w:r>
           </w:p>
         </w:tc>
@@ -8514,7 +8514,7 @@
               <w:rPr>
                 <w:sz w:val="17"/>
               </w:rPr>
-              <w:t>6,561</w:t>
+              <w:t>6,391</w:t>
             </w:r>
           </w:p>
         </w:tc>
@@ -8622,7 +8622,7 @@
               <w:rPr>
                 <w:sz w:val="17"/>
               </w:rPr>
-              <w:t>10,756</w:t>
+              <w:t>10,586</w:t>
             </w:r>
           </w:p>
         </w:tc>
@@ -8635,7 +8635,7 @@
               <w:rPr>
                 <w:sz w:val="17"/>
               </w:rPr>
-              <w:t>17,067</w:t>
+              <w:t>16,897</w:t>
             </w:r>
           </w:p>
         </w:tc>
@@ -8648,7 +8648,7 @@
               <w:rPr>
                 <w:sz w:val="17"/>
               </w:rPr>
-              <w:t>12,826</w:t>
+              <w:t>12,656</w:t>
             </w:r>
           </w:p>
         </w:tc>
@@ -8961,7 +8961,7 @@
               <w:rPr>
                 <w:sz w:val="17"/>
               </w:rPr>
-              <w:t>5.32%</w:t>
+              <w:t>4.93%</w:t>
             </w:r>
           </w:p>
         </w:tc>
@@ -9121,7 +9121,7 @@
               <w:rPr>
                 <w:sz w:val="17"/>
               </w:rPr>
-              <w:t>7,003</w:t>
+              <w:t>6,283</w:t>
             </w:r>
           </w:p>
         </w:tc>
@@ -9134,7 +9134,7 @@
               <w:rPr>
                 <w:sz w:val="17"/>
               </w:rPr>
-              <w:t>5,261</w:t>
+              <w:t>5,091</w:t>
             </w:r>
           </w:p>
         </w:tc>
@@ -9147,7 +9147,7 @@
               <w:rPr>
                 <w:sz w:val="17"/>
               </w:rPr>
-              <w:t>7,287</w:t>
+              <w:t>7,117</w:t>
             </w:r>
           </w:p>
         </w:tc>
@@ -9201,7 +9201,7 @@
               <w:rPr>
                 <w:sz w:val="17"/>
               </w:rPr>
-              <w:t>7,003</w:t>
+              <w:t>6,283</w:t>
             </w:r>
           </w:p>
         </w:tc>
@@ -9214,7 +9214,7 @@
               <w:rPr>
                 <w:sz w:val="17"/>
               </w:rPr>
-              <w:t>5,261</w:t>
+              <w:t>5,091</w:t>
             </w:r>
           </w:p>
         </w:tc>
@@ -9227,7 +9227,7 @@
               <w:rPr>
                 <w:sz w:val="17"/>
               </w:rPr>
-              <w:t>7,287</w:t>
+              <w:t>7,117</w:t>
             </w:r>
           </w:p>
         </w:tc>
@@ -9312,7 +9312,7 @@
               <w:rPr>
                 <w:sz w:val="17"/>
               </w:rPr>
-              <w:t>9.97%</w:t>
+              <w:t>9.90%</w:t>
             </w:r>
           </w:p>
         </w:tc>
@@ -9325,7 +9325,7 @@
               <w:rPr>
                 <w:sz w:val="17"/>
               </w:rPr>
-              <w:t>10.97%</w:t>
+              <w:t>10.90%</w:t>
             </w:r>
           </w:p>
         </w:tc>
@@ -9338,7 +9338,7 @@
               <w:rPr>
                 <w:sz w:val="17"/>
               </w:rPr>
-              <w:t>11.97%</w:t>
+              <w:t>11.90%</w:t>
             </w:r>
           </w:p>
         </w:tc>
@@ -9351,7 +9351,7 @@
               <w:rPr>
                 <w:sz w:val="17"/>
               </w:rPr>
-              <w:t>12.97%</w:t>
+              <w:t>12.90%</w:t>
             </w:r>
           </w:p>
         </w:tc>
@@ -9364,7 +9364,7 @@
               <w:rPr>
                 <w:sz w:val="17"/>
               </w:rPr>
-              <w:t>13.97%</w:t>
+              <w:t>13.90%</w:t>
             </w:r>
           </w:p>
         </w:tc>
@@ -9392,7 +9392,7 @@
               <w:rPr>
                 <w:sz w:val="17"/>
               </w:rPr>
-              <w:t>8,383</w:t>
+              <w:t>7,675</w:t>
             </w:r>
           </w:p>
         </w:tc>
@@ -9405,7 +9405,7 @@
               <w:rPr>
                 <w:sz w:val="17"/>
               </w:rPr>
-              <w:t>7,609</w:t>
+              <w:t>6,894</w:t>
             </w:r>
           </w:p>
         </w:tc>
@@ -9418,7 +9418,7 @@
               <w:rPr>
                 <w:sz w:val="17"/>
               </w:rPr>
-              <w:t>6,975</w:t>
+              <w:t>6,255</w:t>
             </w:r>
           </w:p>
         </w:tc>
@@ -9431,7 +9431,7 @@
               <w:rPr>
                 <w:sz w:val="17"/>
               </w:rPr>
-              <w:t>6,449</w:t>
+              <w:t>5,726</w:t>
             </w:r>
           </w:p>
         </w:tc>
@@ -9444,7 +9444,7 @@
               <w:rPr>
                 <w:sz w:val="17"/>
               </w:rPr>
-              <w:t>6,006</w:t>
+              <w:t>5,282</w:t>
             </w:r>
           </w:p>
         </w:tc>
@@ -9472,7 +9472,7 @@
               <w:rPr>
                 <w:sz w:val="17"/>
               </w:rPr>
-              <w:t>8,402</w:t>
+              <w:t>7,695</w:t>
             </w:r>
           </w:p>
         </w:tc>
@@ -9485,7 +9485,7 @@
               <w:rPr>
                 <w:sz w:val="17"/>
               </w:rPr>
-              <w:t>7,625</w:t>
+              <w:t>6,910</w:t>
             </w:r>
           </w:p>
         </w:tc>
@@ -9498,7 +9498,7 @@
               <w:rPr>
                 <w:sz w:val="17"/>
               </w:rPr>
-              <w:t>6,989</w:t>
+              <w:t>6,269</w:t>
             </w:r>
           </w:p>
         </w:tc>
@@ -9511,7 +9511,7 @@
               <w:rPr>
                 <w:sz w:val="17"/>
               </w:rPr>
-              <w:t>6,460</w:t>
+              <w:t>5,738</w:t>
             </w:r>
           </w:p>
         </w:tc>
@@ -9524,7 +9524,7 @@
               <w:rPr>
                 <w:sz w:val="17"/>
               </w:rPr>
-              <w:t>6,016</w:t>
+              <w:t>5,293</w:t>
             </w:r>
           </w:p>
         </w:tc>
@@ -9552,7 +9552,7 @@
               <w:rPr>
                 <w:sz w:val="17"/>
               </w:rPr>
-              <w:t>8,422</w:t>
+              <w:t>7,715</w:t>
             </w:r>
           </w:p>
         </w:tc>
@@ -9565,7 +9565,7 @@
               <w:rPr>
                 <w:sz w:val="17"/>
               </w:rPr>
-              <w:t>7,641</w:t>
+              <w:t>6,927</w:t>
             </w:r>
           </w:p>
         </w:tc>
@@ -9578,7 +9578,7 @@
               <w:rPr>
                 <w:sz w:val="17"/>
               </w:rPr>
-              <w:t>7,003</w:t>
+              <w:t>6,283</w:t>
             </w:r>
           </w:p>
         </w:tc>
@@ -9591,7 +9591,7 @@
               <w:rPr>
                 <w:sz w:val="17"/>
               </w:rPr>
-              <w:t>6,472</w:t>
+              <w:t>5,750</w:t>
             </w:r>
           </w:p>
         </w:tc>
@@ -9604,7 +9604,7 @@
               <w:rPr>
                 <w:sz w:val="17"/>
               </w:rPr>
-              <w:t>6,026</w:t>
+              <w:t>5,303</w:t>
             </w:r>
           </w:p>
         </w:tc>
@@ -9632,7 +9632,7 @@
               <w:rPr>
                 <w:sz w:val="17"/>
               </w:rPr>
-              <w:t>8,442</w:t>
+              <w:t>7,735</w:t>
             </w:r>
           </w:p>
         </w:tc>
@@ -9645,7 +9645,7 @@
               <w:rPr>
                 <w:sz w:val="17"/>
               </w:rPr>
-              <w:t>7,658</w:t>
+              <w:t>6,943</w:t>
             </w:r>
           </w:p>
         </w:tc>
@@ -9658,7 +9658,7 @@
               <w:rPr>
                 <w:sz w:val="17"/>
               </w:rPr>
-              <w:t>7,017</w:t>
+              <w:t>6,297</w:t>
             </w:r>
           </w:p>
         </w:tc>
@@ -9671,7 +9671,7 @@
               <w:rPr>
                 <w:sz w:val="17"/>
               </w:rPr>
-              <w:t>6,484</w:t>
+              <w:t>5,762</w:t>
             </w:r>
           </w:p>
         </w:tc>
@@ -9684,7 +9684,7 @@
               <w:rPr>
                 <w:sz w:val="17"/>
               </w:rPr>
-              <w:t>6,036</w:t>
+              <w:t>5,313</w:t>
             </w:r>
           </w:p>
         </w:tc>
@@ -9712,7 +9712,7 @@
               <w:rPr>
                 <w:sz w:val="17"/>
               </w:rPr>
-              <w:t>8,462</w:t>
+              <w:t>7,755</w:t>
             </w:r>
           </w:p>
         </w:tc>
@@ -9725,7 +9725,7 @@
               <w:rPr>
                 <w:sz w:val="17"/>
               </w:rPr>
-              <w:t>7,675</w:t>
+              <w:t>6,960</w:t>
             </w:r>
           </w:p>
         </w:tc>
@@ -9738,7 +9738,7 @@
               <w:rPr>
                 <w:sz w:val="17"/>
               </w:rPr>
-              <w:t>7,031</w:t>
+              <w:t>6,312</w:t>
             </w:r>
           </w:p>
         </w:tc>
@@ -9751,7 +9751,7 @@
               <w:rPr>
                 <w:sz w:val="17"/>
               </w:rPr>
-              <w:t>6,496</w:t>
+              <w:t>5,775</w:t>
             </w:r>
           </w:p>
         </w:tc>
@@ -9764,7 +9764,7 @@
               <w:rPr>
                 <w:sz w:val="17"/>
               </w:rPr>
-              <w:t>6,047</w:t>
+              <w:t>5,324</w:t>
             </w:r>
           </w:p>
         </w:tc>
@@ -9895,7 +9895,7 @@
               <w:rPr>
                 <w:sz w:val="17"/>
               </w:rPr>
-              <w:t>3,822</w:t>
+              <w:t>3,233</w:t>
             </w:r>
           </w:p>
         </w:tc>
@@ -9908,7 +9908,7 @@
               <w:rPr>
                 <w:sz w:val="17"/>
               </w:rPr>
-              <w:t>5,296</w:t>
+              <w:t>4,716</w:t>
             </w:r>
           </w:p>
         </w:tc>
@@ -9921,7 +9921,7 @@
               <w:rPr>
                 <w:sz w:val="17"/>
               </w:rPr>
-              <w:t>6,763</w:t>
+              <w:t>6,192</w:t>
             </w:r>
           </w:p>
         </w:tc>
@@ -9934,7 +9934,7 @@
               <w:rPr>
                 <w:sz w:val="17"/>
               </w:rPr>
-              <w:t>8,223</w:t>
+              <w:t>7,661</w:t>
             </w:r>
           </w:p>
         </w:tc>
@@ -9947,7 +9947,7 @@
               <w:rPr>
                 <w:sz w:val="17"/>
               </w:rPr>
-              <w:t>9,680</w:t>
+              <w:t>9,128</w:t>
             </w:r>
           </w:p>
         </w:tc>
@@ -9975,7 +9975,7 @@
               <w:rPr>
                 <w:sz w:val="17"/>
               </w:rPr>
-              <w:t>3,802</w:t>
+              <w:t>3,139</w:t>
             </w:r>
           </w:p>
         </w:tc>
@@ -9988,7 +9988,7 @@
               <w:rPr>
                 <w:sz w:val="17"/>
               </w:rPr>
-              <w:t>5,345</w:t>
+              <w:t>4,691</w:t>
             </w:r>
           </w:p>
         </w:tc>
@@ -10001,7 +10001,7 @@
               <w:rPr>
                 <w:sz w:val="17"/>
               </w:rPr>
-              <w:t>6,881</w:t>
+              <w:t>6,237</w:t>
             </w:r>
           </w:p>
         </w:tc>
@@ -10014,7 +10014,7 @@
               <w:rPr>
                 <w:sz w:val="17"/>
               </w:rPr>
-              <w:t>8,409</w:t>
+              <w:t>7,775</w:t>
             </w:r>
           </w:p>
         </w:tc>
@@ -10027,7 +10027,7 @@
               <w:rPr>
                 <w:sz w:val="17"/>
               </w:rPr>
-              <w:t>9,936</w:t>
+              <w:t>9,311</w:t>
             </w:r>
           </w:p>
         </w:tc>
@@ -10055,7 +10055,7 @@
               <w:rPr>
                 <w:sz w:val="17"/>
               </w:rPr>
-              <w:t>3,783</w:t>
+              <w:t>3,043</w:t>
             </w:r>
           </w:p>
         </w:tc>
@@ -10068,7 +10068,7 @@
               <w:rPr>
                 <w:sz w:val="17"/>
               </w:rPr>
-              <w:t>5,397</w:t>
+              <w:t>4,667</w:t>
             </w:r>
           </w:p>
         </w:tc>
@@ -10081,7 +10081,7 @@
               <w:rPr>
                 <w:sz w:val="17"/>
               </w:rPr>
-              <w:t>7,003</w:t>
+              <w:t>6,283</w:t>
             </w:r>
           </w:p>
         </w:tc>
@@ -10094,7 +10094,7 @@
               <w:rPr>
                 <w:sz w:val="17"/>
               </w:rPr>
-              <w:t>8,602</w:t>
+              <w:t>7,893</w:t>
             </w:r>
           </w:p>
         </w:tc>
@@ -10107,7 +10107,7 @@
               <w:rPr>
                 <w:sz w:val="17"/>
               </w:rPr>
-              <w:t>10,200</w:t>
+              <w:t>9,501</w:t>
             </w:r>
           </w:p>
         </w:tc>
@@ -10135,7 +10135,7 @@
               <w:rPr>
                 <w:sz w:val="17"/>
               </w:rPr>
-              <w:t>3,763</w:t>
+              <w:t>2,945</w:t>
             </w:r>
           </w:p>
         </w:tc>
@@ -10148,7 +10148,7 @@
               <w:rPr>
                 <w:sz w:val="17"/>
               </w:rPr>
-              <w:t>5,450</w:t>
+              <w:t>4,642</w:t>
             </w:r>
           </w:p>
         </w:tc>
@@ -10161,7 +10161,7 @@
               <w:rPr>
                 <w:sz w:val="17"/>
               </w:rPr>
-              <w:t>7,129</w:t>
+              <w:t>6,332</w:t>
             </w:r>
           </w:p>
         </w:tc>
@@ -10174,7 +10174,7 @@
               <w:rPr>
                 <w:sz w:val="17"/>
               </w:rPr>
-              <w:t>8,801</w:t>
+              <w:t>8,015</w:t>
             </w:r>
           </w:p>
         </w:tc>
@@ -10187,7 +10187,7 @@
               <w:rPr>
                 <w:sz w:val="17"/>
               </w:rPr>
-              <w:t>10,473</w:t>
+              <w:t>9,697</w:t>
             </w:r>
           </w:p>
         </w:tc>
@@ -10215,7 +10215,7 @@
               <w:rPr>
                 <w:sz w:val="17"/>
               </w:rPr>
-              <w:t>3,744</w:t>
+              <w:t>2,844</w:t>
             </w:r>
           </w:p>
         </w:tc>
@@ -10228,7 +10228,7 @@
               <w:rPr>
                 <w:sz w:val="17"/>
               </w:rPr>
-              <w:t>5,506</w:t>
+              <w:t>4,617</w:t>
             </w:r>
           </w:p>
         </w:tc>
@@ -10241,7 +10241,7 @@
               <w:rPr>
                 <w:sz w:val="17"/>
               </w:rPr>
-              <w:t>7,260</w:t>
+              <w:t>6,382</w:t>
             </w:r>
           </w:p>
         </w:tc>
@@ -10254,7 +10254,7 @@
               <w:rPr>
                 <w:sz w:val="17"/>
               </w:rPr>
-              <w:t>9,008</w:t>
+              <w:t>8,141</w:t>
             </w:r>
           </w:p>
         </w:tc>
@@ -10267,7 +10267,7 @@
               <w:rPr>
                 <w:sz w:val="17"/>
               </w:rPr>
-              <w:t>10,754</w:t>
+              <w:t>9,899</w:t>
             </w:r>
           </w:p>
         </w:tc>
@@ -10370,7 +10370,7 @@
               <w:rPr>
                 <w:sz w:val="17"/>
               </w:rPr>
-              <w:t>7,616</w:t>
+              <w:t>6,899</w:t>
             </w:r>
           </w:p>
         </w:tc>
@@ -10383,7 +10383,7 @@
               <w:rPr>
                 <w:sz w:val="17"/>
               </w:rPr>
-              <w:t>6,989</w:t>
+              <w:t>6,276</w:t>
             </w:r>
           </w:p>
         </w:tc>
@@ -10396,7 +10396,7 @@
               <w:rPr>
                 <w:sz w:val="17"/>
               </w:rPr>
-              <w:t>6,466</w:t>
+              <w:t>5,757</w:t>
             </w:r>
           </w:p>
         </w:tc>
@@ -10424,7 +10424,7 @@
               <w:rPr>
                 <w:sz w:val="17"/>
               </w:rPr>
-              <w:t>7,003</w:t>
+              <w:t>6,283</w:t>
             </w:r>
           </w:p>
         </w:tc>
@@ -10437,7 +10437,7 @@
               <w:rPr>
                 <w:sz w:val="17"/>
               </w:rPr>
-              <w:t>6,478</w:t>
+              <w:t>5,763</w:t>
             </w:r>
           </w:p>
         </w:tc>
@@ -10450,7 +10450,7 @@
               <w:rPr>
                 <w:sz w:val="17"/>
               </w:rPr>
-              <w:t>6,036</w:t>
+              <w:t>5,325</w:t>
             </w:r>
           </w:p>
         </w:tc>
@@ -10478,7 +10478,7 @@
               <w:rPr>
                 <w:sz w:val="17"/>
               </w:rPr>
-              <w:t>6,489</w:t>
+              <w:t>5,769</w:t>
             </w:r>
           </w:p>
         </w:tc>
@@ -10491,7 +10491,7 @@
               <w:rPr>
                 <w:sz w:val="17"/>
               </w:rPr>
-              <w:t>6,046</w:t>
+              <w:t>5,330</w:t>
             </w:r>
           </w:p>
         </w:tc>
@@ -10504,7 +10504,7 @@
               <w:rPr>
                 <w:sz w:val="17"/>
               </w:rPr>
-              <w:t>5,668</w:t>
+              <w:t>4,957</w:t>
             </w:r>
           </w:p>
         </w:tc>
@@ -10621,7 +10621,7 @@
               <w:rPr>
                 <w:sz w:val="17"/>
               </w:rPr>
-              <w:t>7,003</w:t>
+              <w:t>6,283</w:t>
             </w:r>
           </w:p>
         </w:tc>
@@ -10634,7 +10634,7 @@
               <w:rPr>
                 <w:sz w:val="17"/>
               </w:rPr>
-              <w:t>6,478</w:t>
+              <w:t>5,763</w:t>
             </w:r>
           </w:p>
         </w:tc>
@@ -10647,7 +10647,7 @@
               <w:rPr>
                 <w:sz w:val="17"/>
               </w:rPr>
-              <w:t>6,036</w:t>
+              <w:t>5,325</w:t>
             </w:r>
           </w:p>
         </w:tc>
@@ -10660,7 +10660,7 @@
               <w:rPr>
                 <w:sz w:val="17"/>
               </w:rPr>
-              <w:t>5,330</w:t>
+              <w:t>4,626</w:t>
             </w:r>
           </w:p>
         </w:tc>
@@ -10688,7 +10688,7 @@
               <w:rPr>
                 <w:sz w:val="17"/>
               </w:rPr>
-              <w:t>6,888</w:t>
+              <w:t>6,170</w:t>
             </w:r>
           </w:p>
         </w:tc>
@@ -10701,7 +10701,7 @@
               <w:rPr>
                 <w:sz w:val="17"/>
               </w:rPr>
-              <w:t>6,381</w:t>
+              <w:t>5,668</w:t>
             </w:r>
           </w:p>
         </w:tc>
@@ -10714,7 +10714,7 @@
               <w:rPr>
                 <w:sz w:val="17"/>
               </w:rPr>
-              <w:t>5,954</w:t>
+              <w:t>5,244</w:t>
             </w:r>
           </w:p>
         </w:tc>
@@ -10727,7 +10727,7 @@
               <w:rPr>
                 <w:sz w:val="17"/>
               </w:rPr>
-              <w:t>5,270</w:t>
+              <w:t>4,567</w:t>
             </w:r>
           </w:p>
         </w:tc>
@@ -10937,7 +10937,7 @@
               <w:rPr>
                 <w:sz w:val="17"/>
               </w:rPr>
-              <w:t>기본·SRP 0%: MRP 7.0% 7,616원 → 9.0% 6,489원</w:t>
+              <w:t>기본·SRP 0%: MRP 7.0% 6,899원 → 9.0% 5,769원</w:t>
             </w:r>
           </w:p>
         </w:tc>
@@ -11004,7 +11004,7 @@
               <w:rPr>
                 <w:sz w:val="17"/>
               </w:rPr>
-              <w:t>기본·SRP 0%: 5년 7,003원 → 10년 6,888원</w:t>
+              <w:t>기본·SRP 0%: 5년 6,283원 → 10년 6,170원</w:t>
             </w:r>
           </w:p>
         </w:tc>
@@ -11071,7 +11071,7 @@
               <w:rPr>
                 <w:sz w:val="17"/>
               </w:rPr>
-              <w:t>기본: SRP 0% 7,003원 → 2% 6,036원 / 인용 참고값 4.02% 5,330원(Rf 5년)</w:t>
+              <w:t>기본: SRP 0% 6,283원 → 2% 5,325원 / 인용 참고값 4.02% 4,626원(Rf 5년)</w:t>
             </w:r>
           </w:p>
         </w:tc>
@@ -11179,7 +11179,7 @@
               <w:rPr>
                 <w:sz w:val="17"/>
               </w:rPr>
-              <w:t>11.650%, D/E 0.012</w:t>
+              <w:t>5.563%, D/E 0.028</w:t>
             </w:r>
           </w:p>
         </w:tc>
@@ -11272,7 +11272,7 @@
               <w:rPr>
                 <w:sz w:val="17"/>
               </w:rPr>
-              <w:t>SRP 0%: 비관 5,345원 / 기본 7,003원 / 낙관 8,801원</w:t>
+              <w:t>SRP 0%: 비관 4,691원 / 기본 6,283원 / 낙관 8,015원</w:t>
             </w:r>
           </w:p>
         </w:tc>
@@ -11339,7 +11339,7 @@
               <w:rPr>
                 <w:sz w:val="17"/>
               </w:rPr>
-              <w:t>WACC 기본 열: g 1.0% 6,975원 → 3.0% 7,031원</w:t>
+              <w:t>WACC 기본 열: g 1.0% 6,255원 → 3.0% 6,312원</w:t>
             </w:r>
           </w:p>
         </w:tc>
@@ -11406,7 +11406,7 @@
               <w:rPr>
                 <w:sz w:val="17"/>
               </w:rPr>
-              <w:t>Exit 주당 7,344원 vs Gordon 7,003원</w:t>
+              <w:t>Exit 주당 6,616원 vs Gordon 6,283원</w:t>
             </w:r>
           </w:p>
         </w:tc>
@@ -11447,7 +11447,7 @@
               <w:rPr>
                 <w:sz w:val="17"/>
               </w:rPr>
-              <w:t>70,980백만원(EV 밖 항목 합계)</w:t>
+              <w:t>65,980백만원(EV 밖 항목 합계)</w:t>
             </w:r>
           </w:p>
         </w:tc>
@@ -11741,7 +11741,7 @@
               <w:rPr>
                 <w:sz w:val="17"/>
               </w:rPr>
-              <w:t>EV/EBITDA 주당 5,261~7,287원</w:t>
+              <w:t>EV/EBITDA 주당 5,091~7,117원</w:t>
             </w:r>
           </w:p>
         </w:tc>
@@ -11875,7 +11875,7 @@
               <w:rPr>
                 <w:sz w:val="17"/>
               </w:rPr>
-              <w:t>수렴: DCF 7,003원 vs 5,261~7,287원</w:t>
+              <w:t>수렴: DCF 6,283원 vs 5,091~7,117원</w:t>
             </w:r>
           </w:p>
         </w:tc>
@@ -11931,7 +11931,7 @@
         <w:pStyle w:val="ListBullet"/>
       </w:pPr>
       <w:r>
-        <w:t>재무: DART 정기보고서(접수번호 20220811000332, 20230310001126, 20240307000953, 20250307001164, 20260313001168, 20260814000905)</w:t>
+        <w:t>재무: DART 정기보고서(접수번호 20220811000332, 20230310001126, 20240307000953, 20250307001164, 20250814003707, 20260313001168, 20260814000905)</w:t>
       </w:r>
     </w:p>
     <w:p>

</xml_diff>